<commit_message>
Home Title Page plus the Icon
</commit_message>
<xml_diff>
--- a/school_release_package/KONEKTA_Quick_Start_and_Troubleshooting.docx
+++ b/school_release_package/KONEKTA_Quick_Start_and_Troubleshooting.docx
@@ -7,15 +7,12 @@
         <w:pStyle w:val="Heading1"/>
       </w:pPr>
       <w:r>
-        <w:t>KONEKTA: School Installation and Troubleshooting (One-Page Guide)</w:t>
+        <w:t>KONEKTA Quick Start and Troubleshooting</w:t>
       </w:r>
     </w:p>
     <w:p>
       <w:r>
-        <w:rPr>
-          <w:i/>
-        </w:rPr>
-        <w:t>For teachers, ICT staff, and school operators.</w:t>
+        <w:t>This guide is written for teachers, students, and school support staff. It uses simple language so anyone can follow it.</w:t>
       </w:r>
     </w:p>
     <w:p>
@@ -23,22 +20,27 @@
         <w:pStyle w:val="Heading2"/>
       </w:pPr>
       <w:r>
-        <w:t>A) Install</w:t>
+        <w:t>1. Quick Start (Teacher)</w:t>
       </w:r>
     </w:p>
     <w:p>
       <w:r>
-        <w:t>1. Double-click KONEKTA-Setup.exe.</w:t>
+        <w:t>1) Open KONEKTA-Setup.exe and finish installation.</w:t>
       </w:r>
     </w:p>
     <w:p>
       <w:r>
-        <w:t>2. Follow the installer wizard and finish installation.</w:t>
+        <w:t>2) Start KONEKTA from Start Menu or desktop shortcut.</w:t>
       </w:r>
     </w:p>
     <w:p>
       <w:r>
-        <w:t>3. Launch KONEKTA from Start Menu or Desktop shortcut.</w:t>
+        <w:t>3) Press Ctrl+T to enter Teacher Mode.</w:t>
+      </w:r>
+    </w:p>
+    <w:p>
+      <w:r>
+        <w:t>4) Open Question Forge and make sure questions are ready before class.</w:t>
       </w:r>
     </w:p>
     <w:p>
@@ -46,27 +48,27 @@
         <w:pStyle w:val="Heading2"/>
       </w:pPr>
       <w:r>
-        <w:t>B) First-Time Classroom Setup</w:t>
+        <w:t>2. Quick Start (Student)</w:t>
       </w:r>
     </w:p>
     <w:p>
       <w:r>
-        <w:t>1. Open Teacher Mode with Ctrl+T.</w:t>
+        <w:t>1) Open KONEKTA and choose your student profile.</w:t>
       </w:r>
     </w:p>
     <w:p>
       <w:r>
-        <w:t>2. Log in using the teacher password configured by your school admin.</w:t>
+        <w:t>2) Move on the map with Arrow Keys or WASD.</w:t>
       </w:r>
     </w:p>
     <w:p>
       <w:r>
-        <w:t>3. Open Question Forge and add questions for each game, language, and difficulty mode.</w:t>
+        <w:t>3) Enter a mini-game area and answer questions with keys 1, 2, 3, or 4.</w:t>
       </w:r>
     </w:p>
     <w:p>
       <w:r>
-        <w:t>4. Test each mini-game once before student use.</w:t>
+        <w:t>4) Press Enter on result screen to save your score.</w:t>
       </w:r>
     </w:p>
     <w:p>
@@ -74,27 +76,27 @@
         <w:pStyle w:val="Heading2"/>
       </w:pPr>
       <w:r>
-        <w:t>C) Common Issues and Quick Fixes</w:t>
+        <w:t>3. Common Problems and Easy Fixes</w:t>
       </w:r>
     </w:p>
     <w:p>
       <w:r>
-        <w:t>No Questions Found: Add questions in Teacher Mode &gt; Question Forge for the selected game/language/difficulty.</w:t>
+        <w:t>Game does not open: Run setup again and open from Start Menu.</w:t>
       </w:r>
     </w:p>
     <w:p>
       <w:r>
-        <w:t>Score not on leaderboard: At the end screen, press Enter to submit score.</w:t>
+        <w:t>No questions found: Teacher should add questions in Teacher Mode &gt; Question Forge.</w:t>
       </w:r>
     </w:p>
     <w:p>
       <w:r>
-        <w:t>Need data backup: Copy the database file before maintenance.</w:t>
+        <w:t>Score did not save: Student should press Enter on result screen.</w:t>
       </w:r>
     </w:p>
     <w:p>
       <w:r>
-        <w:t>Need clean reset: Close KONEKTA, then run reset_konekta_data.bat.</w:t>
+        <w:t>Need fresh reset: Close game, run reset_konekta_data.bat, then reopen game.</w:t>
       </w:r>
     </w:p>
     <w:p>
@@ -102,17 +104,22 @@
         <w:pStyle w:val="Heading2"/>
       </w:pPr>
       <w:r>
-        <w:t>D) Data Location (Packaged Install)</w:t>
+        <w:t>4. Data and Safety</w:t>
       </w:r>
     </w:p>
     <w:p>
       <w:r>
-        <w:t>Database path: %LOCALAPPDATA%\\KONEKTA\\konekta.db</w:t>
+        <w:t>KONEKTA save file location: %LOCALAPPDATA%\KONEKTA\konekta.db</w:t>
       </w:r>
     </w:p>
     <w:p>
       <w:r>
-        <w:t>Open quickly by running open_konekta_data_folder.bat.</w:t>
+        <w:t>Before reset, run backup_konekta_database.bat to keep a safe copy of data.</w:t>
+      </w:r>
+    </w:p>
+    <w:p>
+      <w:r>
+        <w:t>Use install_template_database.bat only if you want to restore a clean starter database.</w:t>
       </w:r>
     </w:p>
     <w:p>
@@ -120,32 +127,27 @@
         <w:pStyle w:val="Heading2"/>
       </w:pPr>
       <w:r>
-        <w:t>E) Included Files in This Bundle</w:t>
+        <w:t>5. Included Support Files</w:t>
       </w:r>
     </w:p>
     <w:p>
       <w:r>
-        <w:t>- KONEKTA-Setup.exe</w:t>
+        <w:t>TROUBLESHOOTING.txt - step-by-step fixes</w:t>
       </w:r>
     </w:p>
     <w:p>
       <w:r>
-        <w:t>- KONEKTA_Quick_Start_and_Troubleshooting.docx</w:t>
+        <w:t>DATABASE_ACCESS.txt - data folder and backup help</w:t>
       </w:r>
     </w:p>
     <w:p>
       <w:r>
-        <w:t>- LICENSE.txt</w:t>
+        <w:t>STUDENT_QUICK_GUIDE.txt - simple student steps</w:t>
       </w:r>
     </w:p>
     <w:p>
       <w:r>
-        <w:t>- open_konekta_data_folder.bat</w:t>
-      </w:r>
-    </w:p>
-    <w:p>
-      <w:r>
-        <w:t>- reset_konekta_data.bat</w:t>
+        <w:t>TEACHER_CLASSROOM_GUIDE.txt - teacher classroom flow</w:t>
       </w:r>
     </w:p>
     <w:sectPr>
@@ -521,10 +523,6 @@
     <w:name w:val="Normal"/>
     <w:qFormat/>
     <w:rsid w:val="00FC693F"/>
-    <w:rPr>
-      <w:rFonts w:ascii="Calibri" w:hAnsi="Calibri"/>
-      <w:sz w:val="22"/>
-    </w:rPr>
   </w:style>
   <w:style w:type="paragraph" w:styleId="Header">
     <w:name w:val="header"/>

</xml_diff>